<commit_message>
v2.17 completed (John's word, 3 October): the Session 7 take-home's first item points to its new companion page — "The second page with this sheet, PROAPT, What Each Step Is For, explains each step and why the order matters." (md record + Word rendition in step; still one page); changelog v2.17 line updated
Co-Authored-By: Claude Opus 5.5 <noreply@anthropic.com>
</commit_message>
<xml_diff>
--- a/_implementation-notes/evening-series/handouts/FotH Pilot Session 7 Homework Handout DRAFT v1.docx
+++ b/_implementation-notes/evening-series/handouts/FotH Pilot Session 7 Homework Handout DRAFT v1.docx
@@ -468,6 +468,18 @@
       </w:pPr>
       <w:r>
         <w:t xml:space="preserve">PROAPT one short passage per day for the next week. The Personal Heart Journal Week 7–8 pages have a daily PROAPT template.</w:t>
+      </w:r>
+      <w:r>
+        <w:t xml:space="preserve"> The second page with this sheet, </w:t>
+      </w:r>
+      <w:r>
+        <w:rPr>
+          <w:i/>
+        </w:rPr>
+        <w:t>PROAPT, What Each Step Is For</w:t>
+      </w:r>
+      <w:r>
+        <w:t>, explains each step and why the order matters.</w:t>
       </w:r>
     </w:p>
     <w:bookmarkEnd w:id="9"/>

</xml_diff>